<commit_message>
Add logo/site hierarchy and contract scope to ARR schema memory
</commit_message>
<xml_diff>
--- a/docs/saas/arr-rebuild/notes/canonical-contract-schema-outline.docx
+++ b/docs/saas/arr-rebuild/notes/canonical-contract-schema-outline.docx
@@ -483,18 +483,40 @@
           <w:sz w:val="24"/>
           <w:sz-cs w:val="24"/>
         </w:rPr>
-        <w:t xml:space="preserve">### 3. Customer / Account</w:t>
-      </w:r>
-    </w:p>
-    <w:p>
-      <w:pPr/>
-      <w:r>
-        <w:rPr>
-          <w:rFonts w:ascii="Helvetica Light" w:hAnsi="Helvetica Light" w:cs="Helvetica Light"/>
-          <w:sz w:val="24"/>
-          <w:sz-cs w:val="24"/>
-        </w:rPr>
-        <w:t xml:space="preserve">Represents the end customer in the revenue dataset.</w:t>
+        <w:t xml:space="preserve">### 3. Logo / Parent Customer</w:t>
+      </w:r>
+    </w:p>
+    <w:p>
+      <w:pPr/>
+      <w:r>
+        <w:rPr>
+          <w:rFonts w:ascii="Helvetica Light" w:hAnsi="Helvetica Light" w:cs="Helvetica Light"/>
+          <w:sz w:val="24"/>
+          <w:sz-cs w:val="24"/>
+        </w:rPr>
+        <w:t xml:space="preserve">Represents the broader commercial parent relationship.</w:t>
+      </w:r>
+    </w:p>
+    <w:p>
+      <w:pPr/>
+      <w:r>
+        <w:rPr>
+          <w:rFonts w:ascii="Helvetica Light" w:hAnsi="Helvetica Light" w:cs="Helvetica Light"/>
+          <w:sz w:val="24"/>
+          <w:sz-cs w:val="24"/>
+        </w:rPr>
+        <w:t xml:space="preserve"/>
+      </w:r>
+    </w:p>
+    <w:p>
+      <w:pPr/>
+      <w:r>
+        <w:rPr>
+          <w:rFonts w:ascii="Helvetica Light" w:hAnsi="Helvetica Light" w:cs="Helvetica Light"/>
+          <w:sz w:val="24"/>
+          <w:sz-cs w:val="24"/>
+        </w:rPr>
+        <w:t xml:space="preserve">This is important for enterprise reporting because one logo may contain many sites, subsidiaries, or acquired entities.</w:t>
       </w:r>
     </w:p>
     <w:p>
@@ -527,18 +549,161 @@
           <w:sz w:val="24"/>
           <w:sz-cs w:val="24"/>
         </w:rPr>
-        <w:t xml:space="preserve">- customer id</w:t>
-      </w:r>
-    </w:p>
-    <w:p>
-      <w:pPr/>
-      <w:r>
-        <w:rPr>
-          <w:rFonts w:ascii="Helvetica Light" w:hAnsi="Helvetica Light" w:cs="Helvetica Light"/>
-          <w:sz w:val="24"/>
-          <w:sz-cs w:val="24"/>
-        </w:rPr>
-        <w:t xml:space="preserve">- customer/account name</w:t>
+        <w:t xml:space="preserve">- logo id</w:t>
+      </w:r>
+    </w:p>
+    <w:p>
+      <w:pPr/>
+      <w:r>
+        <w:rPr>
+          <w:rFonts w:ascii="Helvetica Light" w:hAnsi="Helvetica Light" w:cs="Helvetica Light"/>
+          <w:sz w:val="24"/>
+          <w:sz-cs w:val="24"/>
+        </w:rPr>
+        <w:t xml:space="preserve">- logo name</w:t>
+      </w:r>
+    </w:p>
+    <w:p>
+      <w:pPr/>
+      <w:r>
+        <w:rPr>
+          <w:rFonts w:ascii="Helvetica Light" w:hAnsi="Helvetica Light" w:cs="Helvetica Light"/>
+          <w:sz w:val="24"/>
+          <w:sz-cs w:val="24"/>
+        </w:rPr>
+        <w:t xml:space="preserve">- parent commercial account identifier</w:t>
+      </w:r>
+    </w:p>
+    <w:p>
+      <w:pPr/>
+      <w:r>
+        <w:rPr>
+          <w:rFonts w:ascii="Helvetica Light" w:hAnsi="Helvetica Light" w:cs="Helvetica Light"/>
+          <w:sz w:val="24"/>
+          <w:sz-cs w:val="24"/>
+        </w:rPr>
+        <w:t xml:space="preserve">- CRM parent account id if applicable</w:t>
+      </w:r>
+    </w:p>
+    <w:p>
+      <w:pPr/>
+      <w:r>
+        <w:rPr>
+          <w:rFonts w:ascii="Helvetica Light" w:hAnsi="Helvetica Light" w:cs="Helvetica Light"/>
+          <w:sz w:val="24"/>
+          <w:sz-cs w:val="24"/>
+        </w:rPr>
+        <w:t xml:space="preserve">- status</w:t>
+      </w:r>
+    </w:p>
+    <w:p>
+      <w:pPr/>
+      <w:r>
+        <w:rPr>
+          <w:rFonts w:ascii="Helvetica Light" w:hAnsi="Helvetica Light" w:cs="Helvetica Light"/>
+          <w:sz w:val="24"/>
+          <w:sz-cs w:val="24"/>
+        </w:rPr>
+        <w:t xml:space="preserve"/>
+      </w:r>
+    </w:p>
+    <w:p>
+      <w:pPr/>
+      <w:r>
+        <w:rPr>
+          <w:rFonts w:ascii="Helvetica Light" w:hAnsi="Helvetica Light" w:cs="Helvetica Light"/>
+          <w:sz w:val="24"/>
+          <w:sz-cs w:val="24"/>
+        </w:rPr>
+        <w:t xml:space="preserve">### 4. Site / Account</w:t>
+      </w:r>
+    </w:p>
+    <w:p>
+      <w:pPr/>
+      <w:r>
+        <w:rPr>
+          <w:rFonts w:ascii="Helvetica Light" w:hAnsi="Helvetica Light" w:cs="Helvetica Light"/>
+          <w:sz w:val="24"/>
+          <w:sz-cs w:val="24"/>
+        </w:rPr>
+        <w:t xml:space="preserve">Represents the site-level, subsidiary-level, or billing-level entity in the revenue dataset.</w:t>
+      </w:r>
+    </w:p>
+    <w:p>
+      <w:pPr/>
+      <w:r>
+        <w:rPr>
+          <w:rFonts w:ascii="Helvetica Light" w:hAnsi="Helvetica Light" w:cs="Helvetica Light"/>
+          <w:sz w:val="24"/>
+          <w:sz-cs w:val="24"/>
+        </w:rPr>
+        <w:t xml:space="preserve"/>
+      </w:r>
+    </w:p>
+    <w:p>
+      <w:pPr/>
+      <w:r>
+        <w:rPr>
+          <w:rFonts w:ascii="Helvetica Light" w:hAnsi="Helvetica Light" w:cs="Helvetica Light"/>
+          <w:sz w:val="24"/>
+          <w:sz-cs w:val="24"/>
+        </w:rPr>
+        <w:t xml:space="preserve">This allows the system to distinguish between a parent enterprise logo and the specific local entities that sign contracts, receive invoices, or hold licenses.</w:t>
+      </w:r>
+    </w:p>
+    <w:p>
+      <w:pPr/>
+      <w:r>
+        <w:rPr>
+          <w:rFonts w:ascii="Helvetica Light" w:hAnsi="Helvetica Light" w:cs="Helvetica Light"/>
+          <w:sz w:val="24"/>
+          <w:sz-cs w:val="24"/>
+        </w:rPr>
+        <w:t xml:space="preserve"/>
+      </w:r>
+    </w:p>
+    <w:p>
+      <w:pPr/>
+      <w:r>
+        <w:rPr>
+          <w:rFonts w:ascii="Helvetica Light" w:hAnsi="Helvetica Light" w:cs="Helvetica Light"/>
+          <w:sz w:val="24"/>
+          <w:sz-cs w:val="24"/>
+        </w:rPr>
+        <w:t xml:space="preserve">Key examples:</w:t>
+      </w:r>
+    </w:p>
+    <w:p>
+      <w:pPr/>
+      <w:r>
+        <w:rPr>
+          <w:rFonts w:ascii="Helvetica Light" w:hAnsi="Helvetica Light" w:cs="Helvetica Light"/>
+          <w:sz w:val="24"/>
+          <w:sz-cs w:val="24"/>
+        </w:rPr>
+        <w:t xml:space="preserve">- site id</w:t>
+      </w:r>
+    </w:p>
+    <w:p>
+      <w:pPr/>
+      <w:r>
+        <w:rPr>
+          <w:rFonts w:ascii="Helvetica Light" w:hAnsi="Helvetica Light" w:cs="Helvetica Light"/>
+          <w:sz w:val="24"/>
+          <w:sz-cs w:val="24"/>
+        </w:rPr>
+        <w:t xml:space="preserve">- site name</w:t>
+      </w:r>
+    </w:p>
+    <w:p>
+      <w:pPr/>
+      <w:r>
+        <w:rPr>
+          <w:rFonts w:ascii="Helvetica Light" w:hAnsi="Helvetica Light" w:cs="Helvetica Light"/>
+          <w:sz w:val="24"/>
+          <w:sz-cs w:val="24"/>
+        </w:rPr>
+        <w:t xml:space="preserve">- logo id</w:t>
       </w:r>
     </w:p>
     <w:p>
@@ -560,6 +725,28 @@
           <w:sz w:val="24"/>
           <w:sz-cs w:val="24"/>
         </w:rPr>
+        <w:t xml:space="preserve">- CRM account id</w:t>
+      </w:r>
+    </w:p>
+    <w:p>
+      <w:pPr/>
+      <w:r>
+        <w:rPr>
+          <w:rFonts w:ascii="Helvetica Light" w:hAnsi="Helvetica Light" w:cs="Helvetica Light"/>
+          <w:sz w:val="24"/>
+          <w:sz-cs w:val="24"/>
+        </w:rPr>
+        <w:t xml:space="preserve">- billing/legal entity details</w:t>
+      </w:r>
+    </w:p>
+    <w:p>
+      <w:pPr/>
+      <w:r>
+        <w:rPr>
+          <w:rFonts w:ascii="Helvetica Light" w:hAnsi="Helvetica Light" w:cs="Helvetica Light"/>
+          <w:sz w:val="24"/>
+          <w:sz-cs w:val="24"/>
+        </w:rPr>
         <w:t xml:space="preserve">- parent account if applicable</w:t>
       </w:r>
     </w:p>
@@ -604,7 +791,7 @@
           <w:sz w:val="24"/>
           <w:sz-cs w:val="24"/>
         </w:rPr>
-        <w:t xml:space="preserve">### 4. Contract</w:t>
+        <w:t xml:space="preserve">### 5. Contract</w:t>
       </w:r>
     </w:p>
     <w:p>
@@ -659,7 +846,18 @@
           <w:sz w:val="24"/>
           <w:sz-cs w:val="24"/>
         </w:rPr>
-        <w:t xml:space="preserve">- customer id</w:t>
+        <w:t xml:space="preserve">- site id</w:t>
+      </w:r>
+    </w:p>
+    <w:p>
+      <w:pPr/>
+      <w:r>
+        <w:rPr>
+          <w:rFonts w:ascii="Helvetica Light" w:hAnsi="Helvetica Light" w:cs="Helvetica Light"/>
+          <w:sz w:val="24"/>
+          <w:sz-cs w:val="24"/>
+        </w:rPr>
+        <w:t xml:space="preserve">- logo id</w:t>
       </w:r>
     </w:p>
     <w:p>
@@ -747,6 +945,17 @@
           <w:sz w:val="24"/>
           <w:sz-cs w:val="24"/>
         </w:rPr>
+        <w:t xml:space="preserve">- contract scope (site-specific, multi-site, enterprise-wide)</w:t>
+      </w:r>
+    </w:p>
+    <w:p>
+      <w:pPr/>
+      <w:r>
+        <w:rPr>
+          <w:rFonts w:ascii="Helvetica Light" w:hAnsi="Helvetica Light" w:cs="Helvetica Light"/>
+          <w:sz w:val="24"/>
+          <w:sz-cs w:val="24"/>
+        </w:rPr>
         <w:t xml:space="preserve">- currency</w:t>
       </w:r>
     </w:p>
@@ -813,7 +1022,7 @@
           <w:sz w:val="24"/>
           <w:sz-cs w:val="24"/>
         </w:rPr>
-        <w:t xml:space="preserve">### 5. Contract Line / SKU</w:t>
+        <w:t xml:space="preserve">### 6. Contract Line / SKU</w:t>
       </w:r>
     </w:p>
     <w:p>
@@ -1066,7 +1275,7 @@
           <w:sz w:val="24"/>
           <w:sz-cs w:val="24"/>
         </w:rPr>
-        <w:t xml:space="preserve">### 6. Billing Schedule / Milestone</w:t>
+        <w:t xml:space="preserve">### 7. Billing Schedule / Milestone</w:t>
       </w:r>
     </w:p>
     <w:p>
@@ -1231,7 +1440,7 @@
           <w:sz w:val="24"/>
           <w:sz-cs w:val="24"/>
         </w:rPr>
-        <w:t xml:space="preserve">### 7. Revenue Recognition Schedule (Optional Derived Layer)</w:t>
+        <w:t xml:space="preserve">### 8. Revenue Recognition Schedule (Optional Derived Layer)</w:t>
       </w:r>
     </w:p>
     <w:p>
@@ -1363,7 +1572,7 @@
           <w:sz w:val="24"/>
           <w:sz-cs w:val="24"/>
         </w:rPr>
-        <w:t xml:space="preserve">### 8. Cancellation / Early-Out Terms</w:t>
+        <w:t xml:space="preserve">### 9. Cancellation / Early-Out Terms</w:t>
       </w:r>
     </w:p>
     <w:p>
@@ -1517,7 +1726,7 @@
           <w:sz w:val="24"/>
           <w:sz-cs w:val="24"/>
         </w:rPr>
-        <w:t xml:space="preserve">### 9. Mapping / Normalization Metadata</w:t>
+        <w:t xml:space="preserve">### 10. Mapping / Normalization Metadata</w:t>
       </w:r>
     </w:p>
     <w:p>
@@ -1682,7 +1891,7 @@
           <w:sz w:val="24"/>
           <w:sz-cs w:val="24"/>
         </w:rPr>
-        <w:t xml:space="preserve">### 10. Manual Adjustment / Override</w:t>
+        <w:t xml:space="preserve">### 11. Manual Adjustment / Override</w:t>
       </w:r>
     </w:p>
     <w:p>
@@ -2441,6 +2650,28 @@
           <w:sz w:val="24"/>
           <w:sz-cs w:val="24"/>
         </w:rPr>
+        <w:t xml:space="preserve">- logos / parent customers</w:t>
+      </w:r>
+    </w:p>
+    <w:p>
+      <w:pPr/>
+      <w:r>
+        <w:rPr>
+          <w:rFonts w:ascii="Helvetica Light" w:hAnsi="Helvetica Light" w:cs="Helvetica Light"/>
+          <w:sz w:val="24"/>
+          <w:sz-cs w:val="24"/>
+        </w:rPr>
+        <w:t xml:space="preserve">- sites / billing entities</w:t>
+      </w:r>
+    </w:p>
+    <w:p>
+      <w:pPr/>
+      <w:r>
+        <w:rPr>
+          <w:rFonts w:ascii="Helvetica Light" w:hAnsi="Helvetica Light" w:cs="Helvetica Light"/>
+          <w:sz w:val="24"/>
+          <w:sz-cs w:val="24"/>
+        </w:rPr>
         <w:t xml:space="preserve">- contracts</w:t>
       </w:r>
     </w:p>
@@ -2475,6 +2706,17 @@
           <w:sz-cs w:val="24"/>
         </w:rPr>
         <w:t xml:space="preserve">- cancellation / early-out terms</w:t>
+      </w:r>
+    </w:p>
+    <w:p>
+      <w:pPr/>
+      <w:r>
+        <w:rPr>
+          <w:rFonts w:ascii="Helvetica Light" w:hAnsi="Helvetica Light" w:cs="Helvetica Light"/>
+          <w:sz w:val="24"/>
+          <w:sz-cs w:val="24"/>
+        </w:rPr>
+        <w:t xml:space="preserve">- contract scope / rollup behavior</w:t>
       </w:r>
     </w:p>
     <w:p>

</xml_diff>

<commit_message>
Compare legacy spreadsheet to canonical schema and refine model notes
</commit_message>
<xml_diff>
--- a/docs/saas/arr-rebuild/notes/canonical-contract-schema-outline.docx
+++ b/docs/saas/arr-rebuild/notes/canonical-contract-schema-outline.docx
@@ -2761,6 +2761,149 @@
           <w:sz-cs w:val="24"/>
         </w:rPr>
         <w:t xml:space="preserve">That gives the ARR application a stable foundation and keeps the reporting logic from being overloaded with source-format chaos.</w:t>
+      </w:r>
+    </w:p>
+    <w:p>
+      <w:pPr/>
+      <w:r>
+        <w:rPr>
+          <w:rFonts w:ascii="Helvetica Light" w:hAnsi="Helvetica Light" w:cs="Helvetica Light"/>
+          <w:sz w:val="24"/>
+          <w:sz-cs w:val="24"/>
+        </w:rPr>
+        <w:t xml:space="preserve"/>
+      </w:r>
+    </w:p>
+    <w:p>
+      <w:pPr/>
+      <w:r>
+        <w:rPr>
+          <w:rFonts w:ascii="Helvetica Light" w:hAnsi="Helvetica Light" w:cs="Helvetica Light"/>
+          <w:sz w:val="24"/>
+          <w:sz-cs w:val="24"/>
+        </w:rPr>
+        <w:t xml:space="preserve"/>
+      </w:r>
+    </w:p>
+    <w:p>
+      <w:pPr/>
+      <w:r>
+        <w:rPr>
+          <w:rFonts w:ascii="Helvetica Light" w:hAnsi="Helvetica Light" w:cs="Helvetica Light"/>
+          <w:sz w:val="24"/>
+          <w:sz-cs w:val="24"/>
+        </w:rPr>
+        <w:t xml:space="preserve">### 12. Notes / Issues (Recommended)</w:t>
+      </w:r>
+    </w:p>
+    <w:p>
+      <w:pPr/>
+      <w:r>
+        <w:rPr>
+          <w:rFonts w:ascii="Helvetica Light" w:hAnsi="Helvetica Light" w:cs="Helvetica Light"/>
+          <w:sz w:val="24"/>
+          <w:sz-cs w:val="24"/>
+        </w:rPr>
+        <w:t xml:space="preserve">Represents lightweight business comments, pending renewal notes, and issue tracking tied to customers, contracts, or review items.</w:t>
+      </w:r>
+    </w:p>
+    <w:p>
+      <w:pPr/>
+      <w:r>
+        <w:rPr>
+          <w:rFonts w:ascii="Helvetica Light" w:hAnsi="Helvetica Light" w:cs="Helvetica Light"/>
+          <w:sz w:val="24"/>
+          <w:sz-cs w:val="24"/>
+        </w:rPr>
+        <w:t xml:space="preserve"/>
+      </w:r>
+    </w:p>
+    <w:p>
+      <w:pPr/>
+      <w:r>
+        <w:rPr>
+          <w:rFonts w:ascii="Helvetica Light" w:hAnsi="Helvetica Light" w:cs="Helvetica Light"/>
+          <w:sz w:val="24"/>
+          <w:sz-cs w:val="24"/>
+        </w:rPr>
+        <w:t xml:space="preserve">Key examples:</w:t>
+      </w:r>
+    </w:p>
+    <w:p>
+      <w:pPr/>
+      <w:r>
+        <w:rPr>
+          <w:rFonts w:ascii="Helvetica Light" w:hAnsi="Helvetica Light" w:cs="Helvetica Light"/>
+          <w:sz w:val="24"/>
+          <w:sz-cs w:val="24"/>
+        </w:rPr>
+        <w:t xml:space="preserve">- note id</w:t>
+      </w:r>
+    </w:p>
+    <w:p>
+      <w:pPr/>
+      <w:r>
+        <w:rPr>
+          <w:rFonts w:ascii="Helvetica Light" w:hAnsi="Helvetica Light" w:cs="Helvetica Light"/>
+          <w:sz w:val="24"/>
+          <w:sz-cs w:val="24"/>
+        </w:rPr>
+        <w:t xml:space="preserve">- related entity type/id</w:t>
+      </w:r>
+    </w:p>
+    <w:p>
+      <w:pPr/>
+      <w:r>
+        <w:rPr>
+          <w:rFonts w:ascii="Helvetica Light" w:hAnsi="Helvetica Light" w:cs="Helvetica Light"/>
+          <w:sz w:val="24"/>
+          <w:sz-cs w:val="24"/>
+        </w:rPr>
+        <w:t xml:space="preserve">- status</w:t>
+      </w:r>
+    </w:p>
+    <w:p>
+      <w:pPr/>
+      <w:r>
+        <w:rPr>
+          <w:rFonts w:ascii="Helvetica Light" w:hAnsi="Helvetica Light" w:cs="Helvetica Light"/>
+          <w:sz w:val="24"/>
+          <w:sz-cs w:val="24"/>
+        </w:rPr>
+        <w:t xml:space="preserve">- owner</w:t>
+      </w:r>
+    </w:p>
+    <w:p>
+      <w:pPr/>
+      <w:r>
+        <w:rPr>
+          <w:rFonts w:ascii="Helvetica Light" w:hAnsi="Helvetica Light" w:cs="Helvetica Light"/>
+          <w:sz w:val="24"/>
+          <w:sz-cs w:val="24"/>
+        </w:rPr>
+        <w:t xml:space="preserve">- note/comment text</w:t>
+      </w:r>
+    </w:p>
+    <w:p>
+      <w:pPr/>
+      <w:r>
+        <w:rPr>
+          <w:rFonts w:ascii="Helvetica Light" w:hAnsi="Helvetica Light" w:cs="Helvetica Light"/>
+          <w:sz w:val="24"/>
+          <w:sz-cs w:val="24"/>
+        </w:rPr>
+        <w:t xml:space="preserve">- created by</w:t>
+      </w:r>
+    </w:p>
+    <w:p>
+      <w:pPr/>
+      <w:r>
+        <w:rPr>
+          <w:rFonts w:ascii="Helvetica Light" w:hAnsi="Helvetica Light" w:cs="Helvetica Light"/>
+          <w:sz w:val="24"/>
+          <w:sz-cs w:val="24"/>
+        </w:rPr>
+        <w:t xml:space="preserve">- created at</w:t>
       </w:r>
     </w:p>
     <w:sectPr/>

</xml_diff>